<commit_message>
align acceptance tests with native identity
</commit_message>
<xml_diff>
--- a/docs/testing/SMF_Travel_Rapporto_Completo_Test_v1.6_2026-09-07.docx
+++ b/docs/testing/SMF_Travel_Rapporto_Completo_Test_v1.6_2026-09-07.docx
@@ -12892,7 +12892,7 @@
                 <w:color w:val="000000"/>
                 <w:sz w:val="17"/>
               </w:rPr>
-              <w:t>Ruoli e audience 174-197</w:t>
+              <w:t>Collaudi V3 transazionali</w:t>
             </w:r>
           </w:p>
         </w:tc>
@@ -12918,7 +12918,7 @@
                 <w:color w:val="000000"/>
                 <w:sz w:val="17"/>
               </w:rPr>
-              <w:t>Contratti database verificati; resta la conferma UI su dispositivi e account reali</w:t>
+              <w:t>Accesso agenzia, owner e agenti; gruppi e partecipanti; budget tenant; gamification e contest; notifiche; engagement; scritture programma, partenze e riferimenti; cancellazione BR-019; mutazioni superuser</w:t>
             </w:r>
           </w:p>
         </w:tc>
@@ -12944,7 +12944,7 @@
                 <w:color w:val="000000"/>
                 <w:sz w:val="17"/>
               </w:rPr>
-              <w:t>Parziale: collaudo operatore</w:t>
+              <w:t>Superati con rollback</w:t>
             </w:r>
           </w:p>
         </w:tc>
@@ -12971,7 +12971,7 @@
                 <w:color w:val="000000"/>
                 <w:sz w:val="17"/>
               </w:rPr>
-              <w:t>AI live</w:t>
+              <w:t>Ruoli e audience 174-197</w:t>
             </w:r>
           </w:p>
         </w:tc>
@@ -12996,7 +12996,7 @@
                 <w:color w:val="000000"/>
                 <w:sz w:val="17"/>
               </w:rPr>
-              <w:t>Harness disponibile ma nessuna pianificazione automatica</w:t>
+              <w:t>Contratti database verificati; resta la conferma UI su dispositivi e account reali</w:t>
             </w:r>
           </w:p>
         </w:tc>
@@ -13021,7 +13021,7 @@
                 <w:color w:val="000000"/>
                 <w:sz w:val="17"/>
               </w:rPr>
-              <w:t>Sospeso per decisione costi</w:t>
+              <w:t>Parziale: collaudo operatore</w:t>
             </w:r>
           </w:p>
         </w:tc>
@@ -13049,7 +13049,7 @@
                 <w:color w:val="000000"/>
                 <w:sz w:val="17"/>
               </w:rPr>
-              <w:t>WAF e dominio</w:t>
+              <w:t>AI live</w:t>
             </w:r>
           </w:p>
         </w:tc>
@@ -13075,7 +13075,7 @@
                 <w:color w:val="000000"/>
                 <w:sz w:val="17"/>
               </w:rPr>
-              <w:t>Non configurabile sul dominio condiviso attuale</w:t>
+              <w:t>Harness disponibile ma nessuna pianificazione automatica</w:t>
             </w:r>
           </w:p>
         </w:tc>
@@ -13083,6 +13083,83 @@
           <w:tcPr>
             <w:tcW w:type="dxa" w:w="1800"/>
             <w:shd w:fill="F5F7FA"/>
+            <w:tcMar>
+              <w:top w:w="90" w:type="dxa"/>
+              <w:start w:w="110" w:type="dxa"/>
+              <w:bottom w:w="90" w:type="dxa"/>
+              <w:end w:w="110" w:type="dxa"/>
+            </w:tcMar>
+            <w:vAlign w:val="center"/>
+          </w:tcPr>
+          <w:p>
+            <w:pPr>
+              <w:spacing w:after="0"/>
+            </w:pPr>
+            <w:r>
+              <w:rPr>
+                <w:rFonts w:ascii="Aptos" w:hAnsi="Aptos"/>
+                <w:color w:val="000000"/>
+                <w:sz w:val="17"/>
+              </w:rPr>
+              <w:t>Sospeso per decisione costi</w:t>
+            </w:r>
+          </w:p>
+        </w:tc>
+      </w:tr>
+      <w:tr>
+        <w:tc>
+          <w:tcPr>
+            <w:tcW w:type="dxa" w:w="2160"/>
+            <w:tcMar>
+              <w:top w:w="90" w:type="dxa"/>
+              <w:start w:w="110" w:type="dxa"/>
+              <w:bottom w:w="90" w:type="dxa"/>
+              <w:end w:w="110" w:type="dxa"/>
+            </w:tcMar>
+            <w:vAlign w:val="center"/>
+          </w:tcPr>
+          <w:p>
+            <w:pPr>
+              <w:spacing w:after="0"/>
+            </w:pPr>
+            <w:r>
+              <w:rPr>
+                <w:rFonts w:ascii="Aptos" w:hAnsi="Aptos"/>
+                <w:color w:val="000000"/>
+                <w:sz w:val="17"/>
+              </w:rPr>
+              <w:t>WAF e dominio</w:t>
+            </w:r>
+          </w:p>
+        </w:tc>
+        <w:tc>
+          <w:tcPr>
+            <w:tcW w:type="dxa" w:w="6120"/>
+            <w:tcMar>
+              <w:top w:w="90" w:type="dxa"/>
+              <w:start w:w="110" w:type="dxa"/>
+              <w:bottom w:w="90" w:type="dxa"/>
+              <w:end w:w="110" w:type="dxa"/>
+            </w:tcMar>
+            <w:vAlign w:val="center"/>
+          </w:tcPr>
+          <w:p>
+            <w:pPr>
+              <w:spacing w:after="0"/>
+            </w:pPr>
+            <w:r>
+              <w:rPr>
+                <w:rFonts w:ascii="Aptos" w:hAnsi="Aptos"/>
+                <w:color w:val="000000"/>
+                <w:sz w:val="17"/>
+              </w:rPr>
+              <w:t>Non configurabile sul dominio condiviso attuale</w:t>
+            </w:r>
+          </w:p>
+        </w:tc>
+        <w:tc>
+          <w:tcPr>
+            <w:tcW w:type="dxa" w:w="1800"/>
             <w:tcMar>
               <w:top w:w="90" w:type="dxa"/>
               <w:start w:w="110" w:type="dxa"/>
@@ -13487,7 +13564,7 @@
     </w:p>
     <w:p>
       <w:r>
-        <w:t>Tutti i casi prioritari e i casi della versione 1.3 devono avere esito registrato. Le anomalie bloccanti e gravi devono essere pari a zero. Le anomalie medie o lievi eventualmente rinviate devono avere responsabile, motivazione e data obiettivo. Nessun test AI live deve essere avviato senza autorizzazione esplicita.</w:t>
+        <w:t>Tutti i casi prioritari e i casi della versione 1.4 devono avere esito registrato. Le anomalie bloccanti e gravi devono essere pari a zero. Le anomalie medie o lievi eventualmente rinviate devono avere responsabile, motivazione e data obiettivo. Nessun test AI live deve essere avviato senza autorizzazione esplicita.</w:t>
       </w:r>
     </w:p>
     <w:sectPr>

</xml_diff>

<commit_message>
modernize v3 runtime smoke coverage
</commit_message>
<xml_diff>
--- a/docs/testing/SMF_Travel_Rapporto_Completo_Test_v1.6_2026-09-07.docx
+++ b/docs/testing/SMF_Travel_Rapporto_Completo_Test_v1.6_2026-09-07.docx
@@ -12971,7 +12971,7 @@
                 <w:color w:val="000000"/>
                 <w:sz w:val="17"/>
               </w:rPr>
-              <w:t>Ruoli e audience 174-197</w:t>
+              <w:t>Smoke runtime V3</w:t>
             </w:r>
           </w:p>
         </w:tc>
@@ -12996,7 +12996,7 @@
                 <w:color w:val="000000"/>
                 <w:sz w:val="17"/>
               </w:rPr>
-              <w:t>Contratti database verificati; resta la conferma UI su dispositivi e account reali</w:t>
+              <w:t>Identità e impersonazione native; superuser; dashboard e analytics; viaggi e partecipanti; chat; spese; catalogo; KPI; media e isolamento cross-tenant</w:t>
             </w:r>
           </w:p>
         </w:tc>
@@ -13021,7 +13021,7 @@
                 <w:color w:val="000000"/>
                 <w:sz w:val="17"/>
               </w:rPr>
-              <w:t>Parziale: collaudo operatore</w:t>
+              <w:t>Superati</w:t>
             </w:r>
           </w:p>
         </w:tc>
@@ -13049,7 +13049,7 @@
                 <w:color w:val="000000"/>
                 <w:sz w:val="17"/>
               </w:rPr>
-              <w:t>AI live</w:t>
+              <w:t>Ruoli e audience 174-197</w:t>
             </w:r>
           </w:p>
         </w:tc>
@@ -13075,7 +13075,7 @@
                 <w:color w:val="000000"/>
                 <w:sz w:val="17"/>
               </w:rPr>
-              <w:t>Harness disponibile ma nessuna pianificazione automatica</w:t>
+              <w:t>Contratti database verificati; resta la conferma UI su dispositivi e account reali</w:t>
             </w:r>
           </w:p>
         </w:tc>
@@ -13101,7 +13101,7 @@
                 <w:color w:val="000000"/>
                 <w:sz w:val="17"/>
               </w:rPr>
-              <w:t>Sospeso per decisione costi</w:t>
+              <w:t>Parziale: collaudo operatore</w:t>
             </w:r>
           </w:p>
         </w:tc>
@@ -13128,7 +13128,7 @@
                 <w:color w:val="000000"/>
                 <w:sz w:val="17"/>
               </w:rPr>
-              <w:t>WAF e dominio</w:t>
+              <w:t>AI live</w:t>
             </w:r>
           </w:p>
         </w:tc>
@@ -13153,6 +13153,85 @@
                 <w:color w:val="000000"/>
                 <w:sz w:val="17"/>
               </w:rPr>
+              <w:t>Harness disponibile ma nessuna pianificazione automatica</w:t>
+            </w:r>
+          </w:p>
+        </w:tc>
+        <w:tc>
+          <w:tcPr>
+            <w:tcW w:type="dxa" w:w="1800"/>
+            <w:tcMar>
+              <w:top w:w="90" w:type="dxa"/>
+              <w:start w:w="110" w:type="dxa"/>
+              <w:bottom w:w="90" w:type="dxa"/>
+              <w:end w:w="110" w:type="dxa"/>
+            </w:tcMar>
+            <w:vAlign w:val="center"/>
+          </w:tcPr>
+          <w:p>
+            <w:pPr>
+              <w:spacing w:after="0"/>
+            </w:pPr>
+            <w:r>
+              <w:rPr>
+                <w:rFonts w:ascii="Aptos" w:hAnsi="Aptos"/>
+                <w:color w:val="000000"/>
+                <w:sz w:val="17"/>
+              </w:rPr>
+              <w:t>Sospeso per decisione costi</w:t>
+            </w:r>
+          </w:p>
+        </w:tc>
+      </w:tr>
+      <w:tr>
+        <w:tc>
+          <w:tcPr>
+            <w:tcW w:type="dxa" w:w="2160"/>
+            <w:shd w:fill="F5F7FA"/>
+            <w:tcMar>
+              <w:top w:w="90" w:type="dxa"/>
+              <w:start w:w="110" w:type="dxa"/>
+              <w:bottom w:w="90" w:type="dxa"/>
+              <w:end w:w="110" w:type="dxa"/>
+            </w:tcMar>
+            <w:vAlign w:val="center"/>
+          </w:tcPr>
+          <w:p>
+            <w:pPr>
+              <w:spacing w:after="0"/>
+            </w:pPr>
+            <w:r>
+              <w:rPr>
+                <w:rFonts w:ascii="Aptos" w:hAnsi="Aptos"/>
+                <w:color w:val="000000"/>
+                <w:sz w:val="17"/>
+              </w:rPr>
+              <w:t>WAF e dominio</w:t>
+            </w:r>
+          </w:p>
+        </w:tc>
+        <w:tc>
+          <w:tcPr>
+            <w:tcW w:type="dxa" w:w="6120"/>
+            <w:shd w:fill="F5F7FA"/>
+            <w:tcMar>
+              <w:top w:w="90" w:type="dxa"/>
+              <w:start w:w="110" w:type="dxa"/>
+              <w:bottom w:w="90" w:type="dxa"/>
+              <w:end w:w="110" w:type="dxa"/>
+            </w:tcMar>
+            <w:vAlign w:val="center"/>
+          </w:tcPr>
+          <w:p>
+            <w:pPr>
+              <w:spacing w:after="0"/>
+            </w:pPr>
+            <w:r>
+              <w:rPr>
+                <w:rFonts w:ascii="Aptos" w:hAnsi="Aptos"/>
+                <w:color w:val="000000"/>
+                <w:sz w:val="17"/>
+              </w:rPr>
               <w:t>Non configurabile sul dominio condiviso attuale</w:t>
             </w:r>
           </w:p>
@@ -13160,6 +13239,7 @@
         <w:tc>
           <w:tcPr>
             <w:tcW w:type="dxa" w:w="1800"/>
+            <w:shd w:fill="F5F7FA"/>
             <w:tcMar>
               <w:top w:w="90" w:type="dxa"/>
               <w:start w:w="110" w:type="dxa"/>

</xml_diff>